<commit_message>
Update portfolio copy and CV download
</commit_message>
<xml_diff>
--- a/public/cv/Thanh-Y-Nguyen-CV-2026.docx
+++ b/public/cv/Thanh-Y-Nguyen-CV-2026.docx
@@ -30,7 +30,7 @@
           <w:szCs w:val="18"/>
           <w:color w:val="1F4F8F"/>
         </w:rPr>
-        <w:t>AI &amp; Full-Stack Developer | Honours Computer Science Student</w:t>
+        <w:t>AI &amp; Full-Stack Developer | Research-Focused Software Builder</w:t>
       </w:r>
     </w:p>
     <w:p>
@@ -45,7 +45,7 @@
           <w:szCs w:val="14"/>
           <w:color w:val="374151"/>
         </w:rPr>
-        <w:t>Robertson, QLD | +61 426 685 752 | ynguyenhk@gmail.com | linkedin.com/in/thanh-y-nguyen-803a6726a | github.com/healerHK</w:t>
+        <w:t>Robertson, QLD | +61 426 685 752 | ynguyenhk@gmail.com | linkedin.com/in/thanh-y-nguyen-803a6726a | healerhk.cloud</w:t>
       </w:r>
     </w:p>
     <w:p>
@@ -59,7 +59,7 @@
           <w:sz w:val="15"/>
           <w:szCs w:val="15"/>
         </w:rPr>
-        <w:t>Honours Computer Science student building AI-assisted research tools, full-stack web platforms and practical IT systems across Django/FastAPI, React, geospatial ML, IT support and research communities.</w:t>
+        <w:t>AI and full-stack developer building AI-assisted research tools, web platforms and practical IT systems across Django/FastAPI, React, geospatial ML, IT support and research communities.</w:t>
       </w:r>
     </w:p>
     <w:p>
@@ -122,7 +122,7 @@
           <w:sz w:val="17"/>
           <w:szCs w:val="17"/>
         </w:rPr>
-        <w:t>Research focus: LLMs, Agentic AI, RAG, knowledge graphs and evidence-centered research systems.</w:t>
+        <w:t>Research focus: LLMs, Agentic AI, RAG, knowledge graphs, and the edtech field.</w:t>
       </w:r>
     </w:p>
     <w:p>
@@ -416,7 +416,7 @@
           <w:szCs w:val="17"/>
           <w:color w:val="1F4F8F"/>
         </w:rPr>
-        <w:t>Apr 2025 – May 2025</w:t>
+        <w:t>Apr 2026 – May 2026</w:t>
       </w:r>
     </w:p>
     <w:p>
@@ -642,27 +642,6 @@
           <w:szCs w:val="16"/>
         </w:rPr>
         <w:t>Student Volunteer Chair, ADC 2024 — Gold Coast, Australia &amp; Tokyo, Japan; supported volunteer coordination, session logistics and attendee experience for an international database conference.</w:t>
-      </w:r>
-    </w:p>
-    <w:p>
-      <w:pPr>
-        <w:spacing w:before="0" w:after="1" w:line="193" w:lineRule="auto"/>
-      </w:pPr>
-      <w:r>
-        <w:rPr>
-          <w:rFonts w:ascii="Arial" w:hAnsi="Arial" w:cs="Arial"/>
-          <w:sz w:val="16"/>
-          <w:szCs w:val="16"/>
-        </w:rPr>
-        <w:t xml:space="preserve">• </w:t>
-      </w:r>
-      <w:r>
-        <w:rPr>
-          <w:rFonts w:ascii="Arial" w:hAnsi="Arial" w:cs="Arial"/>
-          <w:sz w:val="16"/>
-          <w:szCs w:val="16"/>
-        </w:rPr>
-        <w:t>Honours research direction: LLMs, Agentic AI, RAG, knowledge graphs and AI-assisted research environments.</w:t>
       </w:r>
     </w:p>
     <w:p>

</xml_diff>